<commit_message>
To Set Login Page Initially and to make root / redirect to /auth
</commit_message>
<xml_diff>
--- a/run_project.docx
+++ b/run_project.docx
@@ -2959,6 +2959,2048 @@
         <w:t xml:space="preserve"> ITM API on :8080 [development]</w:t>
       </w:r>
     </w:p>
+    <w:p/>
+    <w:p/>
+    <w:p/>
+    <w:p/>
+    <w:p>
+      <w:r>
+        <w:t>BOSS, to show auth/</w:t>
+      </w:r>
+      <w:proofErr w:type="spellStart"/>
+      <w:r>
+        <w:t>page.tsx</w:t>
+      </w:r>
+      <w:proofErr w:type="spellEnd"/>
+      <w:r>
+        <w:t xml:space="preserve"> first after running the project, you need to make root / redirect to /auth.</w:t>
+      </w:r>
+    </w:p>
+    <w:p>
+      <w:r>
+        <w:t>Do these files only.</w:t>
+      </w:r>
+    </w:p>
+    <w:p>
+      <w:pPr>
+        <w:rPr>
+          <w:b/>
+          <w:bCs/>
+        </w:rPr>
+      </w:pPr>
+      <w:r>
+        <w:rPr>
+          <w:b/>
+          <w:bCs/>
+        </w:rPr>
+        <w:t>1. Create / replace this file</w:t>
+      </w:r>
+    </w:p>
+    <w:p>
+      <w:r>
+        <w:t>Path:</w:t>
+      </w:r>
+    </w:p>
+    <w:p>
+      <w:r>
+        <w:t>frontend/app/</w:t>
+      </w:r>
+      <w:proofErr w:type="spellStart"/>
+      <w:r>
+        <w:t>page.tsx</w:t>
+      </w:r>
+      <w:proofErr w:type="spellEnd"/>
+    </w:p>
+    <w:p>
+      <w:r>
+        <w:t>Code:</w:t>
+      </w:r>
+    </w:p>
+    <w:p>
+      <w:r>
+        <w:t xml:space="preserve">import </w:t>
+      </w:r>
+      <w:proofErr w:type="gramStart"/>
+      <w:r>
+        <w:t>{ redirect</w:t>
+      </w:r>
+      <w:proofErr w:type="gramEnd"/>
+      <w:r>
+        <w:t xml:space="preserve"> } from "next/navigation";</w:t>
+      </w:r>
+      <w:r>
+        <w:br/>
+      </w:r>
+      <w:r>
+        <w:br/>
+        <w:t xml:space="preserve">export default function </w:t>
+      </w:r>
+      <w:proofErr w:type="spellStart"/>
+      <w:proofErr w:type="gramStart"/>
+      <w:r>
+        <w:t>HomePage</w:t>
+      </w:r>
+      <w:proofErr w:type="spellEnd"/>
+      <w:r>
+        <w:t>(</w:t>
+      </w:r>
+      <w:proofErr w:type="gramEnd"/>
+      <w:r>
+        <w:t>) {</w:t>
+      </w:r>
+      <w:r>
+        <w:br/>
+        <w:t xml:space="preserve">  redirect("/auth");</w:t>
+      </w:r>
+      <w:r>
+        <w:br/>
+        <w:t>}</w:t>
+      </w:r>
+    </w:p>
+    <w:p>
+      <w:r>
+        <w:t>Now when you open:</w:t>
+      </w:r>
+    </w:p>
+    <w:p>
+      <w:r>
+        <w:t>http://localhost:5173</w:t>
+      </w:r>
+    </w:p>
+    <w:p>
+      <w:r>
+        <w:t>It will automatically go to:</w:t>
+      </w:r>
+    </w:p>
+    <w:p>
+      <w:r>
+        <w:t>http://localhost:5173/auth</w:t>
+      </w:r>
+    </w:p>
+    <w:p>
+      <w:r>
+        <w:pict w14:anchorId="77060090">
+          <v:rect id="_x0000_i1037" style="width:0;height:1.5pt" o:hralign="center" o:hrstd="t" o:hr="t" fillcolor="#a0a0a0" stroked="f"/>
+        </w:pict>
+      </w:r>
+    </w:p>
+    <w:p>
+      <w:pPr>
+        <w:rPr>
+          <w:b/>
+          <w:bCs/>
+        </w:rPr>
+      </w:pPr>
+      <w:r>
+        <w:rPr>
+          <w:b/>
+          <w:bCs/>
+        </w:rPr>
+        <w:t>2. Update your frontend/app/auth/</w:t>
+      </w:r>
+      <w:proofErr w:type="spellStart"/>
+      <w:r>
+        <w:rPr>
+          <w:b/>
+          <w:bCs/>
+        </w:rPr>
+        <w:t>page.tsx</w:t>
+      </w:r>
+      <w:proofErr w:type="spellEnd"/>
+    </w:p>
+    <w:p>
+      <w:r>
+        <w:t>This version also checks if token already exists. If already logged in, it sends user to dashboard.</w:t>
+      </w:r>
+    </w:p>
+    <w:p>
+      <w:r>
+        <w:t>"use client";</w:t>
+      </w:r>
+      <w:r>
+        <w:br/>
+      </w:r>
+      <w:r>
+        <w:br/>
+        <w:t xml:space="preserve">import { </w:t>
+      </w:r>
+      <w:proofErr w:type="spellStart"/>
+      <w:r>
+        <w:t>useEffect</w:t>
+      </w:r>
+      <w:proofErr w:type="spellEnd"/>
+      <w:r>
+        <w:t xml:space="preserve">, </w:t>
+      </w:r>
+      <w:proofErr w:type="spellStart"/>
+      <w:r>
+        <w:t>useState</w:t>
+      </w:r>
+      <w:proofErr w:type="spellEnd"/>
+      <w:r>
+        <w:t xml:space="preserve"> } from "react";</w:t>
+      </w:r>
+      <w:r>
+        <w:br/>
+        <w:t xml:space="preserve">import { </w:t>
+      </w:r>
+      <w:proofErr w:type="spellStart"/>
+      <w:r>
+        <w:t>useRouter</w:t>
+      </w:r>
+      <w:proofErr w:type="spellEnd"/>
+      <w:r>
+        <w:t xml:space="preserve"> } from "next/navigation";</w:t>
+      </w:r>
+      <w:r>
+        <w:br/>
+        <w:t>import { Input } from "@/components/</w:t>
+      </w:r>
+      <w:proofErr w:type="spellStart"/>
+      <w:r>
+        <w:t>ui</w:t>
+      </w:r>
+      <w:proofErr w:type="spellEnd"/>
+      <w:r>
+        <w:t>/input";</w:t>
+      </w:r>
+      <w:r>
+        <w:br/>
+        <w:t>import { Button } from "@/components/</w:t>
+      </w:r>
+      <w:proofErr w:type="spellStart"/>
+      <w:r>
+        <w:t>ui</w:t>
+      </w:r>
+      <w:proofErr w:type="spellEnd"/>
+      <w:r>
+        <w:t>/button";</w:t>
+      </w:r>
+      <w:r>
+        <w:br/>
+        <w:t>import { Label } from "@/components/</w:t>
+      </w:r>
+      <w:proofErr w:type="spellStart"/>
+      <w:r>
+        <w:t>ui</w:t>
+      </w:r>
+      <w:proofErr w:type="spellEnd"/>
+      <w:r>
+        <w:t>/label";</w:t>
+      </w:r>
+      <w:r>
+        <w:br/>
+        <w:t xml:space="preserve">import { Eye, </w:t>
+      </w:r>
+      <w:proofErr w:type="spellStart"/>
+      <w:r>
+        <w:t>EyeOff</w:t>
+      </w:r>
+      <w:proofErr w:type="spellEnd"/>
+      <w:r>
+        <w:t xml:space="preserve">, Shield, </w:t>
+      </w:r>
+      <w:proofErr w:type="spellStart"/>
+      <w:r>
+        <w:t>ArrowRight</w:t>
+      </w:r>
+      <w:proofErr w:type="spellEnd"/>
+      <w:r>
+        <w:t>, Loader2 } from "</w:t>
+      </w:r>
+      <w:proofErr w:type="spellStart"/>
+      <w:r>
+        <w:t>lucide</w:t>
+      </w:r>
+      <w:proofErr w:type="spellEnd"/>
+      <w:r>
+        <w:t>-react";</w:t>
+      </w:r>
+      <w:r>
+        <w:br/>
+        <w:t xml:space="preserve">import { </w:t>
+      </w:r>
+      <w:proofErr w:type="spellStart"/>
+      <w:r>
+        <w:t>authApi</w:t>
+      </w:r>
+      <w:proofErr w:type="spellEnd"/>
+      <w:r>
+        <w:t xml:space="preserve"> } from "@/lib/</w:t>
+      </w:r>
+      <w:proofErr w:type="spellStart"/>
+      <w:r>
+        <w:t>api</w:t>
+      </w:r>
+      <w:proofErr w:type="spellEnd"/>
+      <w:r>
+        <w:t>";</w:t>
+      </w:r>
+      <w:r>
+        <w:br/>
+      </w:r>
+      <w:r>
+        <w:br/>
+        <w:t xml:space="preserve">export default function </w:t>
+      </w:r>
+      <w:proofErr w:type="spellStart"/>
+      <w:r>
+        <w:t>AuthPage</w:t>
+      </w:r>
+      <w:proofErr w:type="spellEnd"/>
+      <w:r>
+        <w:t>() {</w:t>
+      </w:r>
+      <w:r>
+        <w:br/>
+      </w:r>
+      <w:r>
+        <w:lastRenderedPageBreak/>
+        <w:t xml:space="preserve">    const router = </w:t>
+      </w:r>
+      <w:proofErr w:type="spellStart"/>
+      <w:r>
+        <w:t>useRouter</w:t>
+      </w:r>
+      <w:proofErr w:type="spellEnd"/>
+      <w:r>
+        <w:t>();</w:t>
+      </w:r>
+      <w:r>
+        <w:br/>
+      </w:r>
+      <w:r>
+        <w:br/>
+        <w:t xml:space="preserve">    const [username, </w:t>
+      </w:r>
+      <w:proofErr w:type="spellStart"/>
+      <w:r>
+        <w:t>setUsername</w:t>
+      </w:r>
+      <w:proofErr w:type="spellEnd"/>
+      <w:r>
+        <w:t xml:space="preserve">] = </w:t>
+      </w:r>
+      <w:proofErr w:type="spellStart"/>
+      <w:r>
+        <w:t>useState</w:t>
+      </w:r>
+      <w:proofErr w:type="spellEnd"/>
+      <w:r>
+        <w:t>("");</w:t>
+      </w:r>
+      <w:r>
+        <w:br/>
+        <w:t xml:space="preserve">    const [password, </w:t>
+      </w:r>
+      <w:proofErr w:type="spellStart"/>
+      <w:r>
+        <w:t>setPassword</w:t>
+      </w:r>
+      <w:proofErr w:type="spellEnd"/>
+      <w:r>
+        <w:t xml:space="preserve">] = </w:t>
+      </w:r>
+      <w:proofErr w:type="spellStart"/>
+      <w:r>
+        <w:t>useState</w:t>
+      </w:r>
+      <w:proofErr w:type="spellEnd"/>
+      <w:r>
+        <w:t>("");</w:t>
+      </w:r>
+      <w:r>
+        <w:br/>
+        <w:t xml:space="preserve">    const [</w:t>
+      </w:r>
+      <w:proofErr w:type="spellStart"/>
+      <w:r>
+        <w:t>showPassword</w:t>
+      </w:r>
+      <w:proofErr w:type="spellEnd"/>
+      <w:r>
+        <w:t xml:space="preserve">, </w:t>
+      </w:r>
+      <w:proofErr w:type="spellStart"/>
+      <w:r>
+        <w:t>setShowPassword</w:t>
+      </w:r>
+      <w:proofErr w:type="spellEnd"/>
+      <w:r>
+        <w:t xml:space="preserve">] = </w:t>
+      </w:r>
+      <w:proofErr w:type="spellStart"/>
+      <w:r>
+        <w:t>useState</w:t>
+      </w:r>
+      <w:proofErr w:type="spellEnd"/>
+      <w:r>
+        <w:t>(false);</w:t>
+      </w:r>
+      <w:r>
+        <w:br/>
+        <w:t xml:space="preserve">    const [error, </w:t>
+      </w:r>
+      <w:proofErr w:type="spellStart"/>
+      <w:r>
+        <w:t>setError</w:t>
+      </w:r>
+      <w:proofErr w:type="spellEnd"/>
+      <w:r>
+        <w:t xml:space="preserve">] = </w:t>
+      </w:r>
+      <w:proofErr w:type="spellStart"/>
+      <w:r>
+        <w:t>useState</w:t>
+      </w:r>
+      <w:proofErr w:type="spellEnd"/>
+      <w:r>
+        <w:t>("");</w:t>
+      </w:r>
+      <w:r>
+        <w:br/>
+        <w:t xml:space="preserve">    const [loading, </w:t>
+      </w:r>
+      <w:proofErr w:type="spellStart"/>
+      <w:r>
+        <w:t>setLoading</w:t>
+      </w:r>
+      <w:proofErr w:type="spellEnd"/>
+      <w:r>
+        <w:t xml:space="preserve">] = </w:t>
+      </w:r>
+      <w:proofErr w:type="spellStart"/>
+      <w:r>
+        <w:t>useState</w:t>
+      </w:r>
+      <w:proofErr w:type="spellEnd"/>
+      <w:r>
+        <w:t>(false);</w:t>
+      </w:r>
+      <w:r>
+        <w:br/>
+      </w:r>
+      <w:r>
+        <w:br/>
+        <w:t xml:space="preserve">    </w:t>
+      </w:r>
+      <w:proofErr w:type="spellStart"/>
+      <w:r>
+        <w:t>useEffect</w:t>
+      </w:r>
+      <w:proofErr w:type="spellEnd"/>
+      <w:r>
+        <w:t>(() =&gt; {</w:t>
+      </w:r>
+      <w:r>
+        <w:br/>
+        <w:t xml:space="preserve">        const token = </w:t>
+      </w:r>
+      <w:proofErr w:type="spellStart"/>
+      <w:r>
+        <w:t>localStorage.getItem</w:t>
+      </w:r>
+      <w:proofErr w:type="spellEnd"/>
+      <w:r>
+        <w:t>("</w:t>
+      </w:r>
+      <w:proofErr w:type="spellStart"/>
+      <w:r>
+        <w:t>itm_token</w:t>
+      </w:r>
+      <w:proofErr w:type="spellEnd"/>
+      <w:r>
+        <w:t>");</w:t>
+      </w:r>
+      <w:r>
+        <w:br/>
+      </w:r>
+      <w:r>
+        <w:br/>
+        <w:t xml:space="preserve">        if (token) {</w:t>
+      </w:r>
+      <w:r>
+        <w:br/>
+        <w:t xml:space="preserve">            </w:t>
+      </w:r>
+      <w:proofErr w:type="spellStart"/>
+      <w:r>
+        <w:t>router.replace</w:t>
+      </w:r>
+      <w:proofErr w:type="spellEnd"/>
+      <w:r>
+        <w:t>("/dashboard");</w:t>
+      </w:r>
+      <w:r>
+        <w:br/>
+        <w:t xml:space="preserve">        }</w:t>
+      </w:r>
+      <w:r>
+        <w:br/>
+        <w:t xml:space="preserve">    }, [router]);</w:t>
+      </w:r>
+      <w:r>
+        <w:br/>
+      </w:r>
+      <w:r>
+        <w:br/>
+        <w:t xml:space="preserve">    const </w:t>
+      </w:r>
+      <w:proofErr w:type="spellStart"/>
+      <w:r>
+        <w:t>handleLogin</w:t>
+      </w:r>
+      <w:proofErr w:type="spellEnd"/>
+      <w:r>
+        <w:t xml:space="preserve"> = async () =&gt; {</w:t>
+      </w:r>
+      <w:r>
+        <w:br/>
+        <w:t xml:space="preserve">        if (!</w:t>
+      </w:r>
+      <w:proofErr w:type="spellStart"/>
+      <w:r>
+        <w:t>username.trim</w:t>
+      </w:r>
+      <w:proofErr w:type="spellEnd"/>
+      <w:r>
+        <w:t>() || !password) {</w:t>
+      </w:r>
+      <w:r>
+        <w:br/>
+        <w:t xml:space="preserve">            </w:t>
+      </w:r>
+      <w:proofErr w:type="spellStart"/>
+      <w:r>
+        <w:t>setError</w:t>
+      </w:r>
+      <w:proofErr w:type="spellEnd"/>
+      <w:r>
+        <w:t>("Please enter username and password.");</w:t>
+      </w:r>
+      <w:r>
+        <w:br/>
+        <w:t xml:space="preserve">            return;</w:t>
+      </w:r>
+      <w:r>
+        <w:br/>
+        <w:t xml:space="preserve">        }</w:t>
+      </w:r>
+      <w:r>
+        <w:br/>
+      </w:r>
+      <w:r>
+        <w:br/>
+        <w:t xml:space="preserve">        </w:t>
+      </w:r>
+      <w:proofErr w:type="spellStart"/>
+      <w:r>
+        <w:t>setError</w:t>
+      </w:r>
+      <w:proofErr w:type="spellEnd"/>
+      <w:r>
+        <w:t>("");</w:t>
+      </w:r>
+      <w:r>
+        <w:br/>
+        <w:t xml:space="preserve">        </w:t>
+      </w:r>
+      <w:proofErr w:type="spellStart"/>
+      <w:r>
+        <w:t>setLoading</w:t>
+      </w:r>
+      <w:proofErr w:type="spellEnd"/>
+      <w:r>
+        <w:t>(true);</w:t>
+      </w:r>
+      <w:r>
+        <w:br/>
+      </w:r>
+      <w:r>
+        <w:br/>
+        <w:t xml:space="preserve">        try {</w:t>
+      </w:r>
+      <w:r>
+        <w:br/>
+        <w:t xml:space="preserve">            const res = await </w:t>
+      </w:r>
+      <w:proofErr w:type="spellStart"/>
+      <w:r>
+        <w:t>authApi.login</w:t>
+      </w:r>
+      <w:proofErr w:type="spellEnd"/>
+      <w:r>
+        <w:t>(</w:t>
+      </w:r>
+      <w:proofErr w:type="spellStart"/>
+      <w:r>
+        <w:t>username.trim</w:t>
+      </w:r>
+      <w:proofErr w:type="spellEnd"/>
+      <w:r>
+        <w:t>(), password);</w:t>
+      </w:r>
+      <w:r>
+        <w:br/>
+      </w:r>
+      <w:r>
+        <w:br/>
+        <w:t xml:space="preserve">            const { token, </w:t>
+      </w:r>
+      <w:proofErr w:type="spellStart"/>
+      <w:r>
+        <w:t>employee_id</w:t>
+      </w:r>
+      <w:proofErr w:type="spellEnd"/>
+      <w:r>
+        <w:t xml:space="preserve">, </w:t>
+      </w:r>
+      <w:proofErr w:type="spellStart"/>
+      <w:r>
+        <w:t>full_name</w:t>
+      </w:r>
+      <w:proofErr w:type="spellEnd"/>
+      <w:r>
+        <w:t xml:space="preserve">, </w:t>
+      </w:r>
+      <w:proofErr w:type="spellStart"/>
+      <w:r>
+        <w:t>user_type</w:t>
+      </w:r>
+      <w:proofErr w:type="spellEnd"/>
+      <w:r>
+        <w:t xml:space="preserve"> } = </w:t>
+      </w:r>
+      <w:proofErr w:type="spellStart"/>
+      <w:r>
+        <w:t>res.data</w:t>
+      </w:r>
+      <w:proofErr w:type="spellEnd"/>
+      <w:r>
+        <w:t>;</w:t>
+      </w:r>
+      <w:r>
+        <w:br/>
+      </w:r>
+      <w:r>
+        <w:br/>
+        <w:t xml:space="preserve">            </w:t>
+      </w:r>
+      <w:proofErr w:type="spellStart"/>
+      <w:r>
+        <w:t>localStorage.setItem</w:t>
+      </w:r>
+      <w:proofErr w:type="spellEnd"/>
+      <w:r>
+        <w:t>("</w:t>
+      </w:r>
+      <w:proofErr w:type="spellStart"/>
+      <w:r>
+        <w:t>itm_token</w:t>
+      </w:r>
+      <w:proofErr w:type="spellEnd"/>
+      <w:r>
+        <w:t>", token);</w:t>
+      </w:r>
+      <w:r>
+        <w:br/>
+        <w:t xml:space="preserve">            </w:t>
+      </w:r>
+      <w:proofErr w:type="spellStart"/>
+      <w:r>
+        <w:t>localStorage.setItem</w:t>
+      </w:r>
+      <w:proofErr w:type="spellEnd"/>
+      <w:r>
+        <w:t>(</w:t>
+      </w:r>
+      <w:r>
+        <w:br/>
+        <w:t xml:space="preserve">                "</w:t>
+      </w:r>
+      <w:proofErr w:type="spellStart"/>
+      <w:r>
+        <w:t>itm_user</w:t>
+      </w:r>
+      <w:proofErr w:type="spellEnd"/>
+      <w:r>
+        <w:t>",</w:t>
+      </w:r>
+      <w:r>
+        <w:br/>
+        <w:t xml:space="preserve">                </w:t>
+      </w:r>
+      <w:proofErr w:type="spellStart"/>
+      <w:r>
+        <w:t>JSON.stringify</w:t>
+      </w:r>
+      <w:proofErr w:type="spellEnd"/>
+      <w:r>
+        <w:t>({</w:t>
+      </w:r>
+      <w:r>
+        <w:br/>
+        <w:t xml:space="preserve">                    </w:t>
+      </w:r>
+      <w:proofErr w:type="spellStart"/>
+      <w:r>
+        <w:t>employee_id</w:t>
+      </w:r>
+      <w:proofErr w:type="spellEnd"/>
+      <w:r>
+        <w:t>,</w:t>
+      </w:r>
+      <w:r>
+        <w:br/>
+        <w:t xml:space="preserve">                    </w:t>
+      </w:r>
+      <w:proofErr w:type="spellStart"/>
+      <w:r>
+        <w:t>full_name</w:t>
+      </w:r>
+      <w:proofErr w:type="spellEnd"/>
+      <w:r>
+        <w:t>,</w:t>
+      </w:r>
+      <w:r>
+        <w:br/>
+        <w:t xml:space="preserve">                    </w:t>
+      </w:r>
+      <w:proofErr w:type="spellStart"/>
+      <w:r>
+        <w:t>user_type</w:t>
+      </w:r>
+      <w:proofErr w:type="spellEnd"/>
+      <w:r>
+        <w:t>,</w:t>
+      </w:r>
+      <w:r>
+        <w:br/>
+        <w:t xml:space="preserve">                })</w:t>
+      </w:r>
+      <w:r>
+        <w:br/>
+      </w:r>
+      <w:r>
+        <w:lastRenderedPageBreak/>
+        <w:t xml:space="preserve">            );</w:t>
+      </w:r>
+      <w:r>
+        <w:br/>
+      </w:r>
+      <w:r>
+        <w:br/>
+        <w:t xml:space="preserve">            </w:t>
+      </w:r>
+      <w:proofErr w:type="spellStart"/>
+      <w:r>
+        <w:t>router.replace</w:t>
+      </w:r>
+      <w:proofErr w:type="spellEnd"/>
+      <w:r>
+        <w:t>("/dashboard");</w:t>
+      </w:r>
+      <w:r>
+        <w:br/>
+        <w:t xml:space="preserve">        } catch (e: any) {</w:t>
+      </w:r>
+      <w:r>
+        <w:br/>
+        <w:t xml:space="preserve">            </w:t>
+      </w:r>
+      <w:proofErr w:type="spellStart"/>
+      <w:r>
+        <w:t>setError</w:t>
+      </w:r>
+      <w:proofErr w:type="spellEnd"/>
+      <w:r>
+        <w:t>(</w:t>
+      </w:r>
+      <w:proofErr w:type="spellStart"/>
+      <w:r>
+        <w:t>e?.message</w:t>
+      </w:r>
+      <w:proofErr w:type="spellEnd"/>
+      <w:r>
+        <w:t xml:space="preserve"> ?? "Login failed.");</w:t>
+      </w:r>
+      <w:r>
+        <w:br/>
+        <w:t xml:space="preserve">        } finally {</w:t>
+      </w:r>
+      <w:r>
+        <w:br/>
+        <w:t xml:space="preserve">            </w:t>
+      </w:r>
+      <w:proofErr w:type="spellStart"/>
+      <w:r>
+        <w:t>setLoading</w:t>
+      </w:r>
+      <w:proofErr w:type="spellEnd"/>
+      <w:r>
+        <w:t>(false);</w:t>
+      </w:r>
+      <w:r>
+        <w:br/>
+        <w:t xml:space="preserve">        }</w:t>
+      </w:r>
+      <w:r>
+        <w:br/>
+        <w:t xml:space="preserve">    };</w:t>
+      </w:r>
+      <w:r>
+        <w:br/>
+      </w:r>
+      <w:r>
+        <w:br/>
+        <w:t xml:space="preserve">    return (</w:t>
+      </w:r>
+      <w:r>
+        <w:br/>
+        <w:t xml:space="preserve">        &lt;div </w:t>
+      </w:r>
+      <w:proofErr w:type="spellStart"/>
+      <w:r>
+        <w:t>className</w:t>
+      </w:r>
+      <w:proofErr w:type="spellEnd"/>
+      <w:r>
+        <w:t xml:space="preserve">="min-h-screen </w:t>
+      </w:r>
+      <w:proofErr w:type="spellStart"/>
+      <w:r>
+        <w:t>bg</w:t>
+      </w:r>
+      <w:proofErr w:type="spellEnd"/>
+      <w:r>
+        <w:t>-gradient-to-</w:t>
+      </w:r>
+      <w:proofErr w:type="spellStart"/>
+      <w:r>
+        <w:t>br</w:t>
+      </w:r>
+      <w:proofErr w:type="spellEnd"/>
+      <w:r>
+        <w:t xml:space="preserve"> from-slate-50 via-blue-50 to-indigo-100 flex items-center justify-center px-4 py-8"&gt;</w:t>
+      </w:r>
+      <w:r>
+        <w:br/>
+        <w:t xml:space="preserve">            &lt;div </w:t>
+      </w:r>
+      <w:proofErr w:type="spellStart"/>
+      <w:r>
+        <w:t>className</w:t>
+      </w:r>
+      <w:proofErr w:type="spellEnd"/>
+      <w:r>
+        <w:t xml:space="preserve">="w-full max-w-4xl grid grid-cols-1 md:grid-cols-2 </w:t>
+      </w:r>
+      <w:proofErr w:type="spellStart"/>
+      <w:r>
+        <w:t>bg</w:t>
+      </w:r>
+      <w:proofErr w:type="spellEnd"/>
+      <w:r>
+        <w:t>-white rounded-2xl shadow-2xl overflow-hidden border border-slate-100"&gt;</w:t>
+      </w:r>
+      <w:r>
+        <w:br/>
+        <w:t xml:space="preserve">                &lt;div </w:t>
+      </w:r>
+      <w:proofErr w:type="spellStart"/>
+      <w:r>
+        <w:t>className</w:t>
+      </w:r>
+      <w:proofErr w:type="spellEnd"/>
+      <w:r>
+        <w:t xml:space="preserve">="hidden </w:t>
+      </w:r>
+      <w:proofErr w:type="spellStart"/>
+      <w:r>
+        <w:t>md:flex</w:t>
+      </w:r>
+      <w:proofErr w:type="spellEnd"/>
+      <w:r>
+        <w:t xml:space="preserve"> flex-col items-center justify-center </w:t>
+      </w:r>
+      <w:proofErr w:type="spellStart"/>
+      <w:r>
+        <w:t>bg</w:t>
+      </w:r>
+      <w:proofErr w:type="spellEnd"/>
+      <w:r>
+        <w:t>-gradient-to-</w:t>
+      </w:r>
+      <w:proofErr w:type="spellStart"/>
+      <w:r>
+        <w:t>br</w:t>
+      </w:r>
+      <w:proofErr w:type="spellEnd"/>
+      <w:r>
+        <w:t xml:space="preserve"> from-slate-900 via-slate-800 to-slate-900 p-10 text-white relative overflow-hidden"&gt;</w:t>
+      </w:r>
+      <w:r>
+        <w:br/>
+        <w:t xml:space="preserve">                    &lt;div </w:t>
+      </w:r>
+      <w:proofErr w:type="spellStart"/>
+      <w:r>
+        <w:t>className</w:t>
+      </w:r>
+      <w:proofErr w:type="spellEnd"/>
+      <w:r>
+        <w:t>="absolute top-0 left-0 w-64 h-64 bg-blue-500/10 rounded-full -translate-x-1/2 -translate-y-1/2" /&gt;</w:t>
+      </w:r>
+      <w:r>
+        <w:br/>
+        <w:t xml:space="preserve">                    &lt;div </w:t>
+      </w:r>
+      <w:proofErr w:type="spellStart"/>
+      <w:r>
+        <w:t>className</w:t>
+      </w:r>
+      <w:proofErr w:type="spellEnd"/>
+      <w:r>
+        <w:t>="absolute bottom-0 right-0 w-80 h-80 bg-indigo-500/10 rounded-full translate-x-1/3 translate-y-1/3" /&gt;</w:t>
+      </w:r>
+      <w:r>
+        <w:br/>
+      </w:r>
+      <w:r>
+        <w:br/>
+        <w:t xml:space="preserve">                    &lt;div </w:t>
+      </w:r>
+      <w:proofErr w:type="spellStart"/>
+      <w:r>
+        <w:t>className</w:t>
+      </w:r>
+      <w:proofErr w:type="spellEnd"/>
+      <w:r>
+        <w:t>="relative z-10 text-center space-y-6"&gt;</w:t>
+      </w:r>
+      <w:r>
+        <w:br/>
+        <w:t xml:space="preserve">                        &lt;div </w:t>
+      </w:r>
+      <w:proofErr w:type="spellStart"/>
+      <w:r>
+        <w:t>className</w:t>
+      </w:r>
+      <w:proofErr w:type="spellEnd"/>
+      <w:r>
+        <w:t xml:space="preserve">="inline-flex items-center justify-center w-20 h-20 rounded-2xl </w:t>
+      </w:r>
+      <w:proofErr w:type="spellStart"/>
+      <w:r>
+        <w:t>bg</w:t>
+      </w:r>
+      <w:proofErr w:type="spellEnd"/>
+      <w:r>
+        <w:t>-white/10 border border-white/20"&gt;</w:t>
+      </w:r>
+      <w:r>
+        <w:br/>
+        <w:t xml:space="preserve">                            &lt;Shield </w:t>
+      </w:r>
+      <w:proofErr w:type="spellStart"/>
+      <w:r>
+        <w:t>className</w:t>
+      </w:r>
+      <w:proofErr w:type="spellEnd"/>
+      <w:r>
+        <w:t>="w-10 h-10 text-white" /&gt;</w:t>
+      </w:r>
+      <w:r>
+        <w:br/>
+        <w:t xml:space="preserve">                        &lt;/div&gt;</w:t>
+      </w:r>
+      <w:r>
+        <w:br/>
+      </w:r>
+      <w:r>
+        <w:br/>
+        <w:t xml:space="preserve">                        &lt;div&gt;</w:t>
+      </w:r>
+      <w:r>
+        <w:br/>
+        <w:t xml:space="preserve">                            &lt;h2 </w:t>
+      </w:r>
+      <w:proofErr w:type="spellStart"/>
+      <w:r>
+        <w:t>className</w:t>
+      </w:r>
+      <w:proofErr w:type="spellEnd"/>
+      <w:r>
+        <w:t>="text-3xl font-bold tracking-tight"&gt;ITM Portal&lt;/h2&gt;</w:t>
+      </w:r>
+      <w:r>
+        <w:br/>
+        <w:t xml:space="preserve">                            &lt;p </w:t>
+      </w:r>
+      <w:proofErr w:type="spellStart"/>
+      <w:r>
+        <w:t>className</w:t>
+      </w:r>
+      <w:proofErr w:type="spellEnd"/>
+      <w:r>
+        <w:t>="text-slate-400 mt-2 text-</w:t>
+      </w:r>
+      <w:proofErr w:type="spellStart"/>
+      <w:r>
+        <w:t>sm</w:t>
+      </w:r>
+      <w:proofErr w:type="spellEnd"/>
+      <w:r>
+        <w:t>"&gt;</w:t>
+      </w:r>
+      <w:r>
+        <w:br/>
+        <w:t xml:space="preserve">                                Information Technology</w:t>
+      </w:r>
+      <w:r>
+        <w:br/>
+        <w:t xml:space="preserve">                                &lt;</w:t>
+      </w:r>
+      <w:proofErr w:type="spellStart"/>
+      <w:r>
+        <w:t>br</w:t>
+      </w:r>
+      <w:proofErr w:type="spellEnd"/>
+      <w:r>
+        <w:t xml:space="preserve"> /&gt;</w:t>
+      </w:r>
+      <w:r>
+        <w:br/>
+        <w:t xml:space="preserve">                                Management System</w:t>
+      </w:r>
+      <w:r>
+        <w:br/>
+        <w:t xml:space="preserve">                            &lt;/p&gt;</w:t>
+      </w:r>
+      <w:r>
+        <w:br/>
+        <w:t xml:space="preserve">                        &lt;/div&gt;</w:t>
+      </w:r>
+      <w:r>
+        <w:br/>
+      </w:r>
+      <w:r>
+        <w:br/>
+        <w:t xml:space="preserve">                        &lt;div </w:t>
+      </w:r>
+      <w:proofErr w:type="spellStart"/>
+      <w:r>
+        <w:t>className</w:t>
+      </w:r>
+      <w:proofErr w:type="spellEnd"/>
+      <w:r>
+        <w:t>="grid grid-cols-2 gap-3 text-left"&gt;</w:t>
+      </w:r>
+      <w:r>
+        <w:br/>
+      </w:r>
+      <w:r>
+        <w:lastRenderedPageBreak/>
+        <w:t xml:space="preserve">                            {[</w:t>
+      </w:r>
+      <w:r>
+        <w:br/>
+        <w:t xml:space="preserve">                                { n: "12,867", l: "Active Assets" },</w:t>
+      </w:r>
+      <w:r>
+        <w:br/>
+        <w:t xml:space="preserve">                                { n: "1,540+", l: "Employees" },</w:t>
+      </w:r>
+      <w:r>
+        <w:br/>
+        <w:t xml:space="preserve">                                { n: "99.9%", l: "Uptime" },</w:t>
+      </w:r>
+      <w:r>
+        <w:br/>
+        <w:t xml:space="preserve">                                { n: "24/7", l: "Support" },</w:t>
+      </w:r>
+      <w:r>
+        <w:br/>
+        <w:t xml:space="preserve">                            ].map((s) =&gt; (</w:t>
+      </w:r>
+      <w:r>
+        <w:br/>
+        <w:t xml:space="preserve">                                &lt;div key={</w:t>
+      </w:r>
+      <w:proofErr w:type="spellStart"/>
+      <w:r>
+        <w:t>s.l</w:t>
+      </w:r>
+      <w:proofErr w:type="spellEnd"/>
+      <w:r>
+        <w:t xml:space="preserve">} </w:t>
+      </w:r>
+      <w:proofErr w:type="spellStart"/>
+      <w:r>
+        <w:t>className</w:t>
+      </w:r>
+      <w:proofErr w:type="spellEnd"/>
+      <w:r>
+        <w:t>="</w:t>
+      </w:r>
+      <w:proofErr w:type="spellStart"/>
+      <w:r>
+        <w:t>bg</w:t>
+      </w:r>
+      <w:proofErr w:type="spellEnd"/>
+      <w:r>
+        <w:t>-white/5 border border-white/10 rounded-xl p-3"&gt;</w:t>
+      </w:r>
+      <w:r>
+        <w:br/>
+        <w:t xml:space="preserve">                                    &lt;p </w:t>
+      </w:r>
+      <w:proofErr w:type="spellStart"/>
+      <w:r>
+        <w:t>className</w:t>
+      </w:r>
+      <w:proofErr w:type="spellEnd"/>
+      <w:r>
+        <w:t>="text-xl font-bold"&gt;{</w:t>
+      </w:r>
+      <w:proofErr w:type="spellStart"/>
+      <w:r>
+        <w:t>s.n</w:t>
+      </w:r>
+      <w:proofErr w:type="spellEnd"/>
+      <w:r>
+        <w:t>}&lt;/p&gt;</w:t>
+      </w:r>
+      <w:r>
+        <w:br/>
+        <w:t xml:space="preserve">                                    &lt;p </w:t>
+      </w:r>
+      <w:proofErr w:type="spellStart"/>
+      <w:r>
+        <w:t>className</w:t>
+      </w:r>
+      <w:proofErr w:type="spellEnd"/>
+      <w:r>
+        <w:t>="text-</w:t>
+      </w:r>
+      <w:proofErr w:type="spellStart"/>
+      <w:r>
+        <w:t>xs</w:t>
+      </w:r>
+      <w:proofErr w:type="spellEnd"/>
+      <w:r>
+        <w:t xml:space="preserve"> text-slate-400 mt-0.5"&gt;{</w:t>
+      </w:r>
+      <w:proofErr w:type="spellStart"/>
+      <w:r>
+        <w:t>s.l</w:t>
+      </w:r>
+      <w:proofErr w:type="spellEnd"/>
+      <w:r>
+        <w:t>}&lt;/p&gt;</w:t>
+      </w:r>
+      <w:r>
+        <w:br/>
+        <w:t xml:space="preserve">                                &lt;/div&gt;</w:t>
+      </w:r>
+      <w:r>
+        <w:br/>
+        <w:t xml:space="preserve">                            ))}</w:t>
+      </w:r>
+      <w:r>
+        <w:br/>
+        <w:t xml:space="preserve">                        &lt;/div&gt;</w:t>
+      </w:r>
+      <w:r>
+        <w:br/>
+        <w:t xml:space="preserve">                    &lt;/div&gt;</w:t>
+      </w:r>
+      <w:r>
+        <w:br/>
+        <w:t xml:space="preserve">                &lt;/div&gt;</w:t>
+      </w:r>
+      <w:r>
+        <w:br/>
+      </w:r>
+      <w:r>
+        <w:br/>
+        <w:t xml:space="preserve">                &lt;div </w:t>
+      </w:r>
+      <w:proofErr w:type="spellStart"/>
+      <w:r>
+        <w:t>className</w:t>
+      </w:r>
+      <w:proofErr w:type="spellEnd"/>
+      <w:r>
+        <w:t>="flex flex-col justify-center p-8 sm:p-10"&gt;</w:t>
+      </w:r>
+      <w:r>
+        <w:br/>
+        <w:t xml:space="preserve">                    &lt;div </w:t>
+      </w:r>
+      <w:proofErr w:type="spellStart"/>
+      <w:r>
+        <w:t>className</w:t>
+      </w:r>
+      <w:proofErr w:type="spellEnd"/>
+      <w:r>
+        <w:t>="</w:t>
+      </w:r>
+      <w:proofErr w:type="spellStart"/>
+      <w:r>
+        <w:t>md:hidden</w:t>
+      </w:r>
+      <w:proofErr w:type="spellEnd"/>
+      <w:r>
+        <w:t xml:space="preserve"> flex items-center gap-3 mb-8"&gt;</w:t>
+      </w:r>
+      <w:r>
+        <w:br/>
+        <w:t xml:space="preserve">                        &lt;div </w:t>
+      </w:r>
+      <w:proofErr w:type="spellStart"/>
+      <w:r>
+        <w:t>className</w:t>
+      </w:r>
+      <w:proofErr w:type="spellEnd"/>
+      <w:r>
+        <w:t>="w-10 h-10 rounded-xl bg-slate-900 flex items-center justify-center"&gt;</w:t>
+      </w:r>
+      <w:r>
+        <w:br/>
+        <w:t xml:space="preserve">                            &lt;Shield </w:t>
+      </w:r>
+      <w:proofErr w:type="spellStart"/>
+      <w:r>
+        <w:t>className</w:t>
+      </w:r>
+      <w:proofErr w:type="spellEnd"/>
+      <w:r>
+        <w:t>="w-5 h-5 text-white" /&gt;</w:t>
+      </w:r>
+      <w:r>
+        <w:br/>
+        <w:t xml:space="preserve">                        &lt;/div&gt;</w:t>
+      </w:r>
+      <w:r>
+        <w:br/>
+      </w:r>
+      <w:r>
+        <w:br/>
+        <w:t xml:space="preserve">                        &lt;div&gt;</w:t>
+      </w:r>
+      <w:r>
+        <w:br/>
+        <w:t xml:space="preserve">                            &lt;p </w:t>
+      </w:r>
+      <w:proofErr w:type="spellStart"/>
+      <w:r>
+        <w:t>className</w:t>
+      </w:r>
+      <w:proofErr w:type="spellEnd"/>
+      <w:r>
+        <w:t>="font-bold text-slate-900"&gt;ITM Portal&lt;/p&gt;</w:t>
+      </w:r>
+      <w:r>
+        <w:br/>
+        <w:t xml:space="preserve">                            &lt;p </w:t>
+      </w:r>
+      <w:proofErr w:type="spellStart"/>
+      <w:r>
+        <w:t>className</w:t>
+      </w:r>
+      <w:proofErr w:type="spellEnd"/>
+      <w:r>
+        <w:t>="text-</w:t>
+      </w:r>
+      <w:proofErr w:type="spellStart"/>
+      <w:r>
+        <w:t>xs</w:t>
+      </w:r>
+      <w:proofErr w:type="spellEnd"/>
+      <w:r>
+        <w:t xml:space="preserve"> text-slate-500"&gt;</w:t>
+      </w:r>
+      <w:proofErr w:type="spellStart"/>
+      <w:r>
+        <w:t>Fiber@Home</w:t>
+      </w:r>
+      <w:proofErr w:type="spellEnd"/>
+      <w:r>
+        <w:t xml:space="preserve"> Ltd.&lt;/p&gt;</w:t>
+      </w:r>
+      <w:r>
+        <w:br/>
+        <w:t xml:space="preserve">                        &lt;/div&gt;</w:t>
+      </w:r>
+      <w:r>
+        <w:br/>
+        <w:t xml:space="preserve">                    &lt;/div&gt;</w:t>
+      </w:r>
+      <w:r>
+        <w:br/>
+      </w:r>
+      <w:r>
+        <w:br/>
+        <w:t xml:space="preserve">                    &lt;div </w:t>
+      </w:r>
+      <w:proofErr w:type="spellStart"/>
+      <w:r>
+        <w:t>className</w:t>
+      </w:r>
+      <w:proofErr w:type="spellEnd"/>
+      <w:r>
+        <w:t>="space-y-1 mb-8"&gt;</w:t>
+      </w:r>
+      <w:r>
+        <w:br/>
+        <w:t xml:space="preserve">                        &lt;h1 </w:t>
+      </w:r>
+      <w:proofErr w:type="spellStart"/>
+      <w:r>
+        <w:t>className</w:t>
+      </w:r>
+      <w:proofErr w:type="spellEnd"/>
+      <w:r>
+        <w:t>="text-2xl font-bold text-slate-900"&gt;Welcome back&lt;/h1&gt;</w:t>
+      </w:r>
+      <w:r>
+        <w:br/>
+        <w:t xml:space="preserve">                        &lt;p </w:t>
+      </w:r>
+      <w:proofErr w:type="spellStart"/>
+      <w:r>
+        <w:t>className</w:t>
+      </w:r>
+      <w:proofErr w:type="spellEnd"/>
+      <w:r>
+        <w:t>="text-</w:t>
+      </w:r>
+      <w:proofErr w:type="spellStart"/>
+      <w:r>
+        <w:t>sm</w:t>
+      </w:r>
+      <w:proofErr w:type="spellEnd"/>
+      <w:r>
+        <w:t xml:space="preserve"> text-slate-500"&gt;Sign in to your account&lt;/p&gt;</w:t>
+      </w:r>
+      <w:r>
+        <w:br/>
+        <w:t xml:space="preserve">                    &lt;/div&gt;</w:t>
+      </w:r>
+      <w:r>
+        <w:br/>
+      </w:r>
+      <w:r>
+        <w:br/>
+        <w:t xml:space="preserve">                    &lt;div </w:t>
+      </w:r>
+      <w:proofErr w:type="spellStart"/>
+      <w:r>
+        <w:t>className</w:t>
+      </w:r>
+      <w:proofErr w:type="spellEnd"/>
+      <w:r>
+        <w:t>="space-y-5"&gt;</w:t>
+      </w:r>
+      <w:r>
+        <w:br/>
+        <w:t xml:space="preserve">                        &lt;div </w:t>
+      </w:r>
+      <w:proofErr w:type="spellStart"/>
+      <w:r>
+        <w:t>className</w:t>
+      </w:r>
+      <w:proofErr w:type="spellEnd"/>
+      <w:r>
+        <w:t>="space-y-1.5"&gt;</w:t>
+      </w:r>
+      <w:r>
+        <w:br/>
+        <w:t xml:space="preserve">                            &lt;Label </w:t>
+      </w:r>
+      <w:proofErr w:type="spellStart"/>
+      <w:r>
+        <w:t>className</w:t>
+      </w:r>
+      <w:proofErr w:type="spellEnd"/>
+      <w:r>
+        <w:t>="text-</w:t>
+      </w:r>
+      <w:proofErr w:type="spellStart"/>
+      <w:r>
+        <w:t>sm</w:t>
+      </w:r>
+      <w:proofErr w:type="spellEnd"/>
+      <w:r>
+        <w:t xml:space="preserve"> font-medium text-slate-700"&gt;</w:t>
+      </w:r>
+      <w:r>
+        <w:br/>
+        <w:t xml:space="preserve">                                Username or Email</w:t>
+      </w:r>
+      <w:r>
+        <w:br/>
+      </w:r>
+      <w:r>
+        <w:lastRenderedPageBreak/>
+        <w:t xml:space="preserve">                            &lt;/Label&gt;</w:t>
+      </w:r>
+      <w:r>
+        <w:br/>
+      </w:r>
+      <w:r>
+        <w:br/>
+        <w:t xml:space="preserve">                            &lt;Input</w:t>
+      </w:r>
+      <w:r>
+        <w:br/>
+        <w:t xml:space="preserve">                                value={username}</w:t>
+      </w:r>
+      <w:r>
+        <w:br/>
+        <w:t xml:space="preserve">                                </w:t>
+      </w:r>
+      <w:proofErr w:type="spellStart"/>
+      <w:r>
+        <w:t>onChange</w:t>
+      </w:r>
+      <w:proofErr w:type="spellEnd"/>
+      <w:r>
+        <w:t xml:space="preserve">={(e) =&gt; </w:t>
+      </w:r>
+      <w:proofErr w:type="spellStart"/>
+      <w:r>
+        <w:t>setUsername</w:t>
+      </w:r>
+      <w:proofErr w:type="spellEnd"/>
+      <w:r>
+        <w:t>(</w:t>
+      </w:r>
+      <w:proofErr w:type="spellStart"/>
+      <w:r>
+        <w:t>e.target.value</w:t>
+      </w:r>
+      <w:proofErr w:type="spellEnd"/>
+      <w:r>
+        <w:t>)}</w:t>
+      </w:r>
+      <w:r>
+        <w:br/>
+        <w:t xml:space="preserve">                                </w:t>
+      </w:r>
+      <w:proofErr w:type="spellStart"/>
+      <w:r>
+        <w:t>onKeyDown</w:t>
+      </w:r>
+      <w:proofErr w:type="spellEnd"/>
+      <w:r>
+        <w:t xml:space="preserve">={(e) =&gt; </w:t>
+      </w:r>
+      <w:proofErr w:type="spellStart"/>
+      <w:r>
+        <w:t>e.key</w:t>
+      </w:r>
+      <w:proofErr w:type="spellEnd"/>
+      <w:r>
+        <w:t xml:space="preserve"> === "Enter" &amp;&amp; </w:t>
+      </w:r>
+      <w:proofErr w:type="spellStart"/>
+      <w:r>
+        <w:t>handleLogin</w:t>
+      </w:r>
+      <w:proofErr w:type="spellEnd"/>
+      <w:r>
+        <w:t>()}</w:t>
+      </w:r>
+      <w:r>
+        <w:br/>
+        <w:t xml:space="preserve">                                type="text"</w:t>
+      </w:r>
+      <w:r>
+        <w:br/>
+        <w:t xml:space="preserve">                                placeholder="username or email"</w:t>
+      </w:r>
+      <w:r>
+        <w:br/>
+        <w:t xml:space="preserve">                                </w:t>
+      </w:r>
+      <w:proofErr w:type="spellStart"/>
+      <w:r>
+        <w:t>autoComplete</w:t>
+      </w:r>
+      <w:proofErr w:type="spellEnd"/>
+      <w:r>
+        <w:t>="username"</w:t>
+      </w:r>
+      <w:r>
+        <w:br/>
+        <w:t xml:space="preserve">                                </w:t>
+      </w:r>
+      <w:proofErr w:type="spellStart"/>
+      <w:r>
+        <w:t>className</w:t>
+      </w:r>
+      <w:proofErr w:type="spellEnd"/>
+      <w:r>
+        <w:t>="h-11 border-slate-200 focus-visible:ring-slate-900"</w:t>
+      </w:r>
+      <w:r>
+        <w:br/>
+        <w:t xml:space="preserve">                            /&gt;</w:t>
+      </w:r>
+      <w:r>
+        <w:br/>
+        <w:t xml:space="preserve">                        &lt;/div&gt;</w:t>
+      </w:r>
+      <w:r>
+        <w:br/>
+      </w:r>
+      <w:r>
+        <w:br/>
+        <w:t xml:space="preserve">                        &lt;div </w:t>
+      </w:r>
+      <w:proofErr w:type="spellStart"/>
+      <w:r>
+        <w:t>className</w:t>
+      </w:r>
+      <w:proofErr w:type="spellEnd"/>
+      <w:r>
+        <w:t>="space-y-1.5"&gt;</w:t>
+      </w:r>
+      <w:r>
+        <w:br/>
+        <w:t xml:space="preserve">                            &lt;Label </w:t>
+      </w:r>
+      <w:proofErr w:type="spellStart"/>
+      <w:r>
+        <w:t>className</w:t>
+      </w:r>
+      <w:proofErr w:type="spellEnd"/>
+      <w:r>
+        <w:t>="text-</w:t>
+      </w:r>
+      <w:proofErr w:type="spellStart"/>
+      <w:r>
+        <w:t>sm</w:t>
+      </w:r>
+      <w:proofErr w:type="spellEnd"/>
+      <w:r>
+        <w:t xml:space="preserve"> font-medium text-slate-700"&gt;</w:t>
+      </w:r>
+      <w:r>
+        <w:br/>
+        <w:t xml:space="preserve">                                Password</w:t>
+      </w:r>
+      <w:r>
+        <w:br/>
+        <w:t xml:space="preserve">                            &lt;/Label&gt;</w:t>
+      </w:r>
+      <w:r>
+        <w:br/>
+      </w:r>
+      <w:r>
+        <w:br/>
+        <w:t xml:space="preserve">                            &lt;div </w:t>
+      </w:r>
+      <w:proofErr w:type="spellStart"/>
+      <w:r>
+        <w:t>className</w:t>
+      </w:r>
+      <w:proofErr w:type="spellEnd"/>
+      <w:r>
+        <w:t>="relative"&gt;</w:t>
+      </w:r>
+      <w:r>
+        <w:br/>
+        <w:t xml:space="preserve">                                &lt;Input</w:t>
+      </w:r>
+      <w:r>
+        <w:br/>
+        <w:t xml:space="preserve">                                    value={password}</w:t>
+      </w:r>
+      <w:r>
+        <w:br/>
+        <w:t xml:space="preserve">                                    </w:t>
+      </w:r>
+      <w:proofErr w:type="spellStart"/>
+      <w:r>
+        <w:t>onChange</w:t>
+      </w:r>
+      <w:proofErr w:type="spellEnd"/>
+      <w:r>
+        <w:t xml:space="preserve">={(e) =&gt; </w:t>
+      </w:r>
+      <w:proofErr w:type="spellStart"/>
+      <w:r>
+        <w:t>setPassword</w:t>
+      </w:r>
+      <w:proofErr w:type="spellEnd"/>
+      <w:r>
+        <w:t>(</w:t>
+      </w:r>
+      <w:proofErr w:type="spellStart"/>
+      <w:r>
+        <w:t>e.target.value</w:t>
+      </w:r>
+      <w:proofErr w:type="spellEnd"/>
+      <w:r>
+        <w:t>)}</w:t>
+      </w:r>
+      <w:r>
+        <w:br/>
+        <w:t xml:space="preserve">                                    </w:t>
+      </w:r>
+      <w:proofErr w:type="spellStart"/>
+      <w:r>
+        <w:t>onKeyDown</w:t>
+      </w:r>
+      <w:proofErr w:type="spellEnd"/>
+      <w:r>
+        <w:t xml:space="preserve">={(e) =&gt; </w:t>
+      </w:r>
+      <w:proofErr w:type="spellStart"/>
+      <w:r>
+        <w:t>e.key</w:t>
+      </w:r>
+      <w:proofErr w:type="spellEnd"/>
+      <w:r>
+        <w:t xml:space="preserve"> === "Enter" &amp;&amp; </w:t>
+      </w:r>
+      <w:proofErr w:type="spellStart"/>
+      <w:r>
+        <w:t>handleLogin</w:t>
+      </w:r>
+      <w:proofErr w:type="spellEnd"/>
+      <w:r>
+        <w:t>()}</w:t>
+      </w:r>
+      <w:r>
+        <w:br/>
+        <w:t xml:space="preserve">                                    type={</w:t>
+      </w:r>
+      <w:proofErr w:type="spellStart"/>
+      <w:r>
+        <w:t>showPassword</w:t>
+      </w:r>
+      <w:proofErr w:type="spellEnd"/>
+      <w:r>
+        <w:t xml:space="preserve"> ? "text" : "password"}</w:t>
+      </w:r>
+      <w:r>
+        <w:br/>
+        <w:t xml:space="preserve">                                    placeholder="Enter password"</w:t>
+      </w:r>
+      <w:r>
+        <w:br/>
+        <w:t xml:space="preserve">                                    </w:t>
+      </w:r>
+      <w:proofErr w:type="spellStart"/>
+      <w:r>
+        <w:t>autoComplete</w:t>
+      </w:r>
+      <w:proofErr w:type="spellEnd"/>
+      <w:r>
+        <w:t>="current-password"</w:t>
+      </w:r>
+      <w:r>
+        <w:br/>
+        <w:t xml:space="preserve">                                    </w:t>
+      </w:r>
+      <w:proofErr w:type="spellStart"/>
+      <w:r>
+        <w:t>className</w:t>
+      </w:r>
+      <w:proofErr w:type="spellEnd"/>
+      <w:r>
+        <w:t>="h-11 pr-10 border-slate-200 focus-visible:ring-slate-900"</w:t>
+      </w:r>
+      <w:r>
+        <w:br/>
+        <w:t xml:space="preserve">                                /&gt;</w:t>
+      </w:r>
+      <w:r>
+        <w:br/>
+      </w:r>
+      <w:r>
+        <w:br/>
+        <w:t xml:space="preserve">                                &lt;button</w:t>
+      </w:r>
+      <w:r>
+        <w:br/>
+        <w:t xml:space="preserve">                                    type="button"</w:t>
+      </w:r>
+      <w:r>
+        <w:br/>
+        <w:t xml:space="preserve">                                    </w:t>
+      </w:r>
+      <w:proofErr w:type="spellStart"/>
+      <w:r>
+        <w:t>onClick</w:t>
+      </w:r>
+      <w:proofErr w:type="spellEnd"/>
+      <w:r>
+        <w:t xml:space="preserve">={() =&gt; </w:t>
+      </w:r>
+      <w:proofErr w:type="spellStart"/>
+      <w:r>
+        <w:t>setShowPassword</w:t>
+      </w:r>
+      <w:proofErr w:type="spellEnd"/>
+      <w:r>
+        <w:t>(!</w:t>
+      </w:r>
+      <w:proofErr w:type="spellStart"/>
+      <w:r>
+        <w:t>showPassword</w:t>
+      </w:r>
+      <w:proofErr w:type="spellEnd"/>
+      <w:r>
+        <w:t>)}</w:t>
+      </w:r>
+      <w:r>
+        <w:br/>
+        <w:t xml:space="preserve">                                    </w:t>
+      </w:r>
+      <w:proofErr w:type="spellStart"/>
+      <w:r>
+        <w:t>className</w:t>
+      </w:r>
+      <w:proofErr w:type="spellEnd"/>
+      <w:r>
+        <w:t>="absolute right-3 top-1/2 -translate-y-1/2 text-slate-400 hover:text-slate-600"</w:t>
+      </w:r>
+      <w:r>
+        <w:br/>
+        <w:t xml:space="preserve">                                &gt;</w:t>
+      </w:r>
+      <w:r>
+        <w:br/>
+        <w:t xml:space="preserve">                                    {</w:t>
+      </w:r>
+      <w:proofErr w:type="spellStart"/>
+      <w:r>
+        <w:t>showPassword</w:t>
+      </w:r>
+      <w:proofErr w:type="spellEnd"/>
+      <w:r>
+        <w:t xml:space="preserve"> ? &lt;</w:t>
+      </w:r>
+      <w:proofErr w:type="spellStart"/>
+      <w:r>
+        <w:t>EyeOff</w:t>
+      </w:r>
+      <w:proofErr w:type="spellEnd"/>
+      <w:r>
+        <w:t xml:space="preserve"> size={16} /&gt; : &lt;Eye size={16} /&gt;}</w:t>
+      </w:r>
+      <w:r>
+        <w:br/>
+        <w:t xml:space="preserve">                                &lt;/button&gt;</w:t>
+      </w:r>
+      <w:r>
+        <w:br/>
+        <w:t xml:space="preserve">                            &lt;/div&gt;</w:t>
+      </w:r>
+      <w:r>
+        <w:br/>
+      </w:r>
+      <w:r>
+        <w:lastRenderedPageBreak/>
+        <w:t xml:space="preserve">                        &lt;/div&gt;</w:t>
+      </w:r>
+      <w:r>
+        <w:br/>
+      </w:r>
+      <w:r>
+        <w:br/>
+        <w:t xml:space="preserve">                        {error &amp;&amp; (</w:t>
+      </w:r>
+      <w:r>
+        <w:br/>
+        <w:t xml:space="preserve">                            &lt;div </w:t>
+      </w:r>
+      <w:proofErr w:type="spellStart"/>
+      <w:r>
+        <w:t>className</w:t>
+      </w:r>
+      <w:proofErr w:type="spellEnd"/>
+      <w:r>
+        <w:t>="text-</w:t>
+      </w:r>
+      <w:proofErr w:type="spellStart"/>
+      <w:r>
+        <w:t>sm</w:t>
+      </w:r>
+      <w:proofErr w:type="spellEnd"/>
+      <w:r>
+        <w:t xml:space="preserve"> text-red-600 bg-red-50 border border-red-100 px-4 py-3 rounded-lg"&gt;</w:t>
+      </w:r>
+      <w:r>
+        <w:br/>
+        <w:t xml:space="preserve">                                {error}</w:t>
+      </w:r>
+      <w:r>
+        <w:br/>
+        <w:t xml:space="preserve">                            &lt;/div&gt;</w:t>
+      </w:r>
+      <w:r>
+        <w:br/>
+        <w:t xml:space="preserve">                        )}</w:t>
+      </w:r>
+      <w:r>
+        <w:br/>
+      </w:r>
+      <w:r>
+        <w:br/>
+        <w:t xml:space="preserve">                        &lt;Button</w:t>
+      </w:r>
+      <w:r>
+        <w:br/>
+        <w:t xml:space="preserve">                            </w:t>
+      </w:r>
+      <w:proofErr w:type="spellStart"/>
+      <w:r>
+        <w:t>onClick</w:t>
+      </w:r>
+      <w:proofErr w:type="spellEnd"/>
+      <w:r>
+        <w:t>={</w:t>
+      </w:r>
+      <w:proofErr w:type="spellStart"/>
+      <w:r>
+        <w:t>handleLogin</w:t>
+      </w:r>
+      <w:proofErr w:type="spellEnd"/>
+      <w:r>
+        <w:t>}</w:t>
+      </w:r>
+      <w:r>
+        <w:br/>
+        <w:t xml:space="preserve">                            disabled={loading}</w:t>
+      </w:r>
+      <w:r>
+        <w:br/>
+        <w:t xml:space="preserve">                            </w:t>
+      </w:r>
+      <w:proofErr w:type="spellStart"/>
+      <w:r>
+        <w:t>className</w:t>
+      </w:r>
+      <w:proofErr w:type="spellEnd"/>
+      <w:r>
+        <w:t>="w-full h-11 bg-slate-900 hover:bg-slate-800 text-white font-medium rounded-xl"</w:t>
+      </w:r>
+      <w:r>
+        <w:br/>
+        <w:t xml:space="preserve">                        &gt;</w:t>
+      </w:r>
+      <w:r>
+        <w:br/>
+        <w:t xml:space="preserve">                            {loading ? (</w:t>
+      </w:r>
+      <w:r>
+        <w:br/>
+        <w:t xml:space="preserve">                                &lt;Loader2 </w:t>
+      </w:r>
+      <w:proofErr w:type="spellStart"/>
+      <w:r>
+        <w:t>className</w:t>
+      </w:r>
+      <w:proofErr w:type="spellEnd"/>
+      <w:r>
+        <w:t>="h-4 w-4 animate-spin" /&gt;</w:t>
+      </w:r>
+      <w:r>
+        <w:br/>
+        <w:t xml:space="preserve">                            ) : (</w:t>
+      </w:r>
+      <w:r>
+        <w:br/>
+        <w:t xml:space="preserve">                                &lt;span </w:t>
+      </w:r>
+      <w:proofErr w:type="spellStart"/>
+      <w:r>
+        <w:t>className</w:t>
+      </w:r>
+      <w:proofErr w:type="spellEnd"/>
+      <w:r>
+        <w:t>="flex items-center gap-2"&gt;</w:t>
+      </w:r>
+      <w:r>
+        <w:br/>
+        <w:t xml:space="preserve">                                    Sign in &lt;</w:t>
+      </w:r>
+      <w:proofErr w:type="spellStart"/>
+      <w:r>
+        <w:t>ArrowRight</w:t>
+      </w:r>
+      <w:proofErr w:type="spellEnd"/>
+      <w:r>
+        <w:t xml:space="preserve"> </w:t>
+      </w:r>
+      <w:proofErr w:type="spellStart"/>
+      <w:r>
+        <w:t>className</w:t>
+      </w:r>
+      <w:proofErr w:type="spellEnd"/>
+      <w:r>
+        <w:t>="h-4 w-4" /&gt;</w:t>
+      </w:r>
+      <w:r>
+        <w:br/>
+        <w:t xml:space="preserve">                                &lt;/span&gt;</w:t>
+      </w:r>
+      <w:r>
+        <w:br/>
+        <w:t xml:space="preserve">                            )}</w:t>
+      </w:r>
+      <w:r>
+        <w:br/>
+        <w:t xml:space="preserve">                        &lt;/Button&gt;</w:t>
+      </w:r>
+      <w:r>
+        <w:br/>
+        <w:t xml:space="preserve">                    &lt;/div&gt;</w:t>
+      </w:r>
+      <w:r>
+        <w:br/>
+      </w:r>
+      <w:r>
+        <w:br/>
+        <w:t xml:space="preserve">                    &lt;p </w:t>
+      </w:r>
+      <w:proofErr w:type="spellStart"/>
+      <w:r>
+        <w:t>className</w:t>
+      </w:r>
+      <w:proofErr w:type="spellEnd"/>
+      <w:r>
+        <w:t>="text-center text-</w:t>
+      </w:r>
+      <w:proofErr w:type="spellStart"/>
+      <w:r>
+        <w:t>xs</w:t>
+      </w:r>
+      <w:proofErr w:type="spellEnd"/>
+      <w:r>
+        <w:t xml:space="preserve"> text-slate-400 mt-8"&gt;</w:t>
+      </w:r>
+      <w:r>
+        <w:br/>
+        <w:t xml:space="preserve">                        © 2026 </w:t>
+      </w:r>
+      <w:proofErr w:type="spellStart"/>
+      <w:r>
+        <w:t>Fiber@Home</w:t>
+      </w:r>
+      <w:proofErr w:type="spellEnd"/>
+      <w:r>
+        <w:t xml:space="preserve"> Ltd. · All rights reserved</w:t>
+      </w:r>
+      <w:r>
+        <w:br/>
+        <w:t xml:space="preserve">                    &lt;/p&gt;</w:t>
+      </w:r>
+      <w:r>
+        <w:br/>
+        <w:t xml:space="preserve">                &lt;/div&gt;</w:t>
+      </w:r>
+      <w:r>
+        <w:br/>
+        <w:t xml:space="preserve">            &lt;/div&gt;</w:t>
+      </w:r>
+      <w:r>
+        <w:br/>
+        <w:t xml:space="preserve">        &lt;/div&gt;</w:t>
+      </w:r>
+      <w:r>
+        <w:br/>
+        <w:t xml:space="preserve">    );</w:t>
+      </w:r>
+      <w:r>
+        <w:br/>
+        <w:t>}</w:t>
+      </w:r>
+    </w:p>
+    <w:p>
+      <w:r>
+        <w:pict w14:anchorId="3C5080F6">
+          <v:rect id="_x0000_i1038" style="width:0;height:1.5pt" o:hralign="center" o:hrstd="t" o:hr="t" fillcolor="#a0a0a0" stroked="f"/>
+        </w:pict>
+      </w:r>
+    </w:p>
+    <w:p>
+      <w:pPr>
+        <w:rPr>
+          <w:b/>
+          <w:bCs/>
+        </w:rPr>
+      </w:pPr>
+      <w:r>
+        <w:rPr>
+          <w:b/>
+          <w:bCs/>
+        </w:rPr>
+        <w:t>3. Restart frontend</w:t>
+      </w:r>
+    </w:p>
+    <w:p>
+      <w:r>
+        <w:rPr>
+          <w:b/>
+          <w:bCs/>
+        </w:rPr>
+        <w:lastRenderedPageBreak/>
+        <w:t>cd D:\ITM-Data\itm\frontend</w:t>
+      </w:r>
+      <w:r>
+        <w:br/>
+      </w:r>
+      <w:proofErr w:type="spellStart"/>
+      <w:r>
+        <w:t>npx</w:t>
+      </w:r>
+      <w:proofErr w:type="spellEnd"/>
+      <w:r>
+        <w:t xml:space="preserve"> next dev -p 5173</w:t>
+      </w:r>
+    </w:p>
+    <w:p>
+      <w:pPr>
+        <w:rPr>
+          <w:color w:val="0070C0"/>
+        </w:rPr>
+      </w:pPr>
+      <w:r>
+        <w:rPr>
+          <w:color w:val="0070C0"/>
+        </w:rPr>
+        <w:t>Now flow will be:</w:t>
+      </w:r>
+    </w:p>
+    <w:p>
+      <w:r>
+        <w:t>http://localhost:5173</w:t>
+      </w:r>
+      <w:r>
+        <w:br/>
+        <w:t xml:space="preserve">        ↓</w:t>
+      </w:r>
+      <w:r>
+        <w:br/>
+        <w:t>/auth</w:t>
+      </w:r>
+      <w:r>
+        <w:br/>
+        <w:t xml:space="preserve">        ↓ login success</w:t>
+      </w:r>
+      <w:r>
+        <w:br/>
+        <w:t>/dashboard</w:t>
+      </w:r>
+    </w:p>
+    <w:p/>
     <w:sectPr>
       <w:pgSz w:w="12240" w:h="15840"/>
       <w:pgMar w:top="1440" w:right="1440" w:bottom="1440" w:left="1440" w:header="720" w:footer="720" w:gutter="0"/>
@@ -3572,7 +5614,6 @@
   <w:style w:type="character" w:default="1" w:styleId="DefaultParagraphFont">
     <w:name w:val="Default Paragraph Font"/>
     <w:uiPriority w:val="1"/>
-    <w:semiHidden/>
     <w:unhideWhenUsed/>
   </w:style>
   <w:style w:type="table" w:default="1" w:styleId="TableNormal">

</xml_diff>

<commit_message>
To Set Test Database (itm_restore_test) and logged in successfylly
</commit_message>
<xml_diff>
--- a/run_project.docx
+++ b/run_project.docx
@@ -150,15 +150,7 @@
       </w:r>
       <w:proofErr w:type="spellEnd"/>
       <w:r>
-        <w:t xml:space="preserve"> </w:t>
-      </w:r>
-      <w:proofErr w:type="spellStart"/>
-      <w:r>
-        <w:t>i</w:t>
-      </w:r>
-      <w:proofErr w:type="spellEnd"/>
-      <w:r>
-        <w:t xml:space="preserve"> </w:t>
+        <w:t xml:space="preserve"> i </w:t>
       </w:r>
       <w:proofErr w:type="spellStart"/>
       <w:r>
@@ -3080,7 +3072,7 @@
     <w:p>
       <w:r>
         <w:pict w14:anchorId="77060090">
-          <v:rect id="_x0000_i1037" style="width:0;height:1.5pt" o:hralign="center" o:hrstd="t" o:hr="t" fillcolor="#a0a0a0" stroked="f"/>
+          <v:rect id="_x0000_i1025" style="width:0;height:1.5pt" o:hralign="center" o:hrstd="t" o:hr="t" fillcolor="#a0a0a0" stroked="f"/>
         </w:pict>
       </w:r>
     </w:p>
@@ -4033,23 +4025,7 @@
       </w:r>
       <w:proofErr w:type="spellEnd"/>
       <w:r>
-        <w:t xml:space="preserve">} </w:t>
-      </w:r>
-      <w:proofErr w:type="spellStart"/>
-      <w:r>
-        <w:t>className</w:t>
-      </w:r>
-      <w:proofErr w:type="spellEnd"/>
-      <w:r>
-        <w:t>="</w:t>
-      </w:r>
-      <w:proofErr w:type="spellStart"/>
-      <w:r>
-        <w:t>bg</w:t>
-      </w:r>
-      <w:proofErr w:type="spellEnd"/>
-      <w:r>
-        <w:t>-white/5 border border-white/10 rounded-xl p-3"&gt;</w:t>
+        <w:t>} className="bg-white/5 border border-white/10 rounded-xl p-3"&gt;</w:t>
       </w:r>
       <w:r>
         <w:br/>
@@ -4837,7 +4813,30 @@
       </w:r>
       <w:proofErr w:type="spellEnd"/>
       <w:r>
-        <w:t xml:space="preserve"> </w:t>
+        <w:t xml:space="preserve"> className="h-4 w-4" /&gt;</w:t>
+      </w:r>
+      <w:r>
+        <w:br/>
+        <w:t xml:space="preserve">                                &lt;/span&gt;</w:t>
+      </w:r>
+      <w:r>
+        <w:br/>
+        <w:t xml:space="preserve">                            )}</w:t>
+      </w:r>
+      <w:r>
+        <w:br/>
+        <w:t xml:space="preserve">                        &lt;/Button&gt;</w:t>
+      </w:r>
+      <w:r>
+        <w:br/>
+        <w:t xml:space="preserve">                    &lt;/div&gt;</w:t>
+      </w:r>
+      <w:r>
+        <w:br/>
+      </w:r>
+      <w:r>
+        <w:br/>
+        <w:t xml:space="preserve">                    &lt;p </w:t>
       </w:r>
       <w:proofErr w:type="spellStart"/>
       <w:r>
@@ -4845,37 +4844,6 @@
       </w:r>
       <w:proofErr w:type="spellEnd"/>
       <w:r>
-        <w:t>="h-4 w-4" /&gt;</w:t>
-      </w:r>
-      <w:r>
-        <w:br/>
-        <w:t xml:space="preserve">                                &lt;/span&gt;</w:t>
-      </w:r>
-      <w:r>
-        <w:br/>
-        <w:t xml:space="preserve">                            )}</w:t>
-      </w:r>
-      <w:r>
-        <w:br/>
-        <w:t xml:space="preserve">                        &lt;/Button&gt;</w:t>
-      </w:r>
-      <w:r>
-        <w:br/>
-        <w:t xml:space="preserve">                    &lt;/div&gt;</w:t>
-      </w:r>
-      <w:r>
-        <w:br/>
-      </w:r>
-      <w:r>
-        <w:br/>
-        <w:t xml:space="preserve">                    &lt;p </w:t>
-      </w:r>
-      <w:proofErr w:type="spellStart"/>
-      <w:r>
-        <w:t>className</w:t>
-      </w:r>
-      <w:proofErr w:type="spellEnd"/>
-      <w:r>
         <w:t>="text-center text-</w:t>
       </w:r>
       <w:proofErr w:type="spellStart"/>
@@ -4926,7 +4894,7 @@
     <w:p>
       <w:r>
         <w:pict w14:anchorId="3C5080F6">
-          <v:rect id="_x0000_i1038" style="width:0;height:1.5pt" o:hralign="center" o:hrstd="t" o:hr="t" fillcolor="#a0a0a0" stroked="f"/>
+          <v:rect id="_x0000_i1026" style="width:0;height:1.5pt" o:hralign="center" o:hrstd="t" o:hr="t" fillcolor="#a0a0a0" stroked="f"/>
         </w:pict>
       </w:r>
     </w:p>
@@ -5000,6 +4968,325 @@
         <w:t>/dashboard</w:t>
       </w:r>
     </w:p>
+    <w:p>
+      <w:pPr>
+        <w:pBdr>
+          <w:bottom w:val="single" w:sz="6" w:space="1" w:color="auto"/>
+        </w:pBdr>
+      </w:pPr>
+    </w:p>
+    <w:p>
+      <w:pPr>
+        <w:rPr>
+          <w:b/>
+          <w:bCs/>
+          <w:sz w:val="28"/>
+          <w:szCs w:val="28"/>
+        </w:rPr>
+      </w:pPr>
+    </w:p>
+    <w:p>
+      <w:pPr>
+        <w:rPr>
+          <w:b/>
+          <w:bCs/>
+          <w:color w:val="4472C4" w:themeColor="accent1"/>
+          <w:sz w:val="28"/>
+          <w:szCs w:val="28"/>
+        </w:rPr>
+      </w:pPr>
+      <w:r>
+        <w:rPr>
+          <w:b/>
+          <w:bCs/>
+          <w:color w:val="4472C4" w:themeColor="accent1"/>
+          <w:sz w:val="28"/>
+          <w:szCs w:val="28"/>
+        </w:rPr>
+        <w:t xml:space="preserve">Backup Database using command </w:t>
+      </w:r>
+    </w:p>
+    <w:p>
+      <w:pPr>
+        <w:rPr>
+          <w:sz w:val="22"/>
+          <w:szCs w:val="22"/>
+        </w:rPr>
+      </w:pPr>
+    </w:p>
+    <w:p>
+      <w:pPr>
+        <w:rPr>
+          <w:sz w:val="22"/>
+          <w:szCs w:val="22"/>
+        </w:rPr>
+      </w:pPr>
+      <w:r>
+        <w:rPr>
+          <w:sz w:val="22"/>
+          <w:szCs w:val="22"/>
+        </w:rPr>
+        <w:t>Microsoft Windows [Version 10.0.26200.8655]</w:t>
+      </w:r>
+    </w:p>
+    <w:p>
+      <w:pPr>
+        <w:rPr>
+          <w:sz w:val="22"/>
+          <w:szCs w:val="22"/>
+        </w:rPr>
+      </w:pPr>
+      <w:r>
+        <w:rPr>
+          <w:sz w:val="22"/>
+          <w:szCs w:val="22"/>
+        </w:rPr>
+        <w:t>(c) Microsoft Corporation. All rights reserved.</w:t>
+      </w:r>
+    </w:p>
+    <w:p>
+      <w:pPr>
+        <w:rPr>
+          <w:sz w:val="22"/>
+          <w:szCs w:val="22"/>
+        </w:rPr>
+      </w:pPr>
+    </w:p>
+    <w:p>
+      <w:pPr>
+        <w:rPr>
+          <w:sz w:val="22"/>
+          <w:szCs w:val="22"/>
+        </w:rPr>
+      </w:pPr>
+    </w:p>
+    <w:p>
+      <w:pPr>
+        <w:rPr>
+          <w:sz w:val="22"/>
+          <w:szCs w:val="22"/>
+        </w:rPr>
+      </w:pPr>
+    </w:p>
+    <w:p>
+      <w:pPr>
+        <w:rPr>
+          <w:sz w:val="22"/>
+          <w:szCs w:val="22"/>
+        </w:rPr>
+      </w:pPr>
+      <w:r>
+        <w:rPr>
+          <w:sz w:val="22"/>
+          <w:szCs w:val="22"/>
+        </w:rPr>
+        <w:t xml:space="preserve">D:\Program Files\PostgreSQL\18\bin&gt;.\pg_dump.exe -h localhost -p 5432 -U </w:t>
+      </w:r>
+      <w:proofErr w:type="spellStart"/>
+      <w:r>
+        <w:rPr>
+          <w:sz w:val="22"/>
+          <w:szCs w:val="22"/>
+        </w:rPr>
+        <w:t>postgres</w:t>
+      </w:r>
+      <w:proofErr w:type="spellEnd"/>
+      <w:r>
+        <w:rPr>
+          <w:sz w:val="22"/>
+          <w:szCs w:val="22"/>
+        </w:rPr>
+        <w:t xml:space="preserve"> -d </w:t>
+      </w:r>
+      <w:proofErr w:type="spellStart"/>
+      <w:r>
+        <w:rPr>
+          <w:sz w:val="22"/>
+          <w:szCs w:val="22"/>
+        </w:rPr>
+        <w:t>itm_prod</w:t>
+      </w:r>
+      <w:proofErr w:type="spellEnd"/>
+      <w:r>
+        <w:rPr>
+          <w:sz w:val="22"/>
+          <w:szCs w:val="22"/>
+        </w:rPr>
+        <w:t xml:space="preserve"> -F c -f "D:\ITM-Data\itm\backup_before_old_data_import.backup"</w:t>
+      </w:r>
+    </w:p>
+    <w:p>
+      <w:pPr>
+        <w:rPr>
+          <w:sz w:val="22"/>
+          <w:szCs w:val="22"/>
+        </w:rPr>
+      </w:pPr>
+      <w:r>
+        <w:rPr>
+          <w:sz w:val="22"/>
+          <w:szCs w:val="22"/>
+        </w:rPr>
+        <w:t>Password:</w:t>
+      </w:r>
+    </w:p>
+    <w:p>
+      <w:pPr>
+        <w:rPr>
+          <w:sz w:val="22"/>
+          <w:szCs w:val="22"/>
+        </w:rPr>
+      </w:pPr>
+    </w:p>
+    <w:p>
+      <w:pPr>
+        <w:rPr>
+          <w:sz w:val="22"/>
+          <w:szCs w:val="22"/>
+        </w:rPr>
+      </w:pPr>
+      <w:r>
+        <w:rPr>
+          <w:sz w:val="22"/>
+          <w:szCs w:val="22"/>
+        </w:rPr>
+        <w:t xml:space="preserve">D:\Program Files\PostgreSQL\18\bin&gt;.\pg_dump.exe -h localhost -p 5432 -U </w:t>
+      </w:r>
+      <w:proofErr w:type="spellStart"/>
+      <w:r>
+        <w:rPr>
+          <w:sz w:val="22"/>
+          <w:szCs w:val="22"/>
+        </w:rPr>
+        <w:t>postgres</w:t>
+      </w:r>
+      <w:proofErr w:type="spellEnd"/>
+      <w:r>
+        <w:rPr>
+          <w:sz w:val="22"/>
+          <w:szCs w:val="22"/>
+        </w:rPr>
+        <w:t xml:space="preserve"> -d </w:t>
+      </w:r>
+      <w:proofErr w:type="spellStart"/>
+      <w:r>
+        <w:rPr>
+          <w:sz w:val="22"/>
+          <w:szCs w:val="22"/>
+        </w:rPr>
+        <w:t>itm_prod</w:t>
+      </w:r>
+      <w:proofErr w:type="spellEnd"/>
+      <w:r>
+        <w:rPr>
+          <w:sz w:val="22"/>
+          <w:szCs w:val="22"/>
+        </w:rPr>
+        <w:t xml:space="preserve"> -F p -f "D:\ITM-Data\itm\backup_before_old_data_import.sql"up"</w:t>
+      </w:r>
+    </w:p>
+    <w:p>
+      <w:pPr>
+        <w:rPr>
+          <w:sz w:val="22"/>
+          <w:szCs w:val="22"/>
+        </w:rPr>
+      </w:pPr>
+      <w:r>
+        <w:rPr>
+          <w:sz w:val="22"/>
+          <w:szCs w:val="22"/>
+        </w:rPr>
+        <w:t>Password:</w:t>
+      </w:r>
+    </w:p>
+    <w:p>
+      <w:pPr>
+        <w:rPr>
+          <w:sz w:val="22"/>
+          <w:szCs w:val="22"/>
+        </w:rPr>
+      </w:pPr>
+    </w:p>
+    <w:p>
+      <w:pPr>
+        <w:rPr>
+          <w:sz w:val="22"/>
+          <w:szCs w:val="22"/>
+        </w:rPr>
+      </w:pPr>
+      <w:r>
+        <w:rPr>
+          <w:sz w:val="22"/>
+          <w:szCs w:val="22"/>
+        </w:rPr>
+        <w:t xml:space="preserve">D:\Program Files\PostgreSQL\18\bin&gt;.\createdb.exe -h localhost -p 5432 -U </w:t>
+      </w:r>
+      <w:proofErr w:type="spellStart"/>
+      <w:r>
+        <w:rPr>
+          <w:sz w:val="22"/>
+          <w:szCs w:val="22"/>
+        </w:rPr>
+        <w:t>postgres</w:t>
+      </w:r>
+      <w:proofErr w:type="spellEnd"/>
+      <w:r>
+        <w:rPr>
+          <w:sz w:val="22"/>
+          <w:szCs w:val="22"/>
+        </w:rPr>
+        <w:t xml:space="preserve"> </w:t>
+      </w:r>
+      <w:proofErr w:type="spellStart"/>
+      <w:r>
+        <w:rPr>
+          <w:sz w:val="22"/>
+          <w:szCs w:val="22"/>
+        </w:rPr>
+        <w:t>itm_restore_test</w:t>
+      </w:r>
+      <w:proofErr w:type="spellEnd"/>
+    </w:p>
+    <w:p>
+      <w:pPr>
+        <w:rPr>
+          <w:sz w:val="22"/>
+          <w:szCs w:val="22"/>
+        </w:rPr>
+      </w:pPr>
+      <w:r>
+        <w:rPr>
+          <w:sz w:val="22"/>
+          <w:szCs w:val="22"/>
+        </w:rPr>
+        <w:t>Password:</w:t>
+      </w:r>
+    </w:p>
+    <w:p>
+      <w:pPr>
+        <w:rPr>
+          <w:sz w:val="22"/>
+          <w:szCs w:val="22"/>
+        </w:rPr>
+      </w:pPr>
+    </w:p>
+    <w:p>
+      <w:pPr>
+        <w:rPr>
+          <w:sz w:val="22"/>
+          <w:szCs w:val="22"/>
+        </w:rPr>
+      </w:pPr>
+      <w:r>
+        <w:rPr>
+          <w:sz w:val="22"/>
+          <w:szCs w:val="22"/>
+        </w:rPr>
+        <w:t>D:\Program Files\PostgreSQL\18\bin&gt;</w:t>
+      </w:r>
+    </w:p>
+    <w:p/>
     <w:p/>
     <w:sectPr>
       <w:pgSz w:w="12240" w:h="15840"/>
@@ -5614,6 +5901,7 @@
   <w:style w:type="character" w:default="1" w:styleId="DefaultParagraphFont">
     <w:name w:val="Default Paragraph Font"/>
     <w:uiPriority w:val="1"/>
+    <w:semiHidden/>
     <w:unhideWhenUsed/>
   </w:style>
   <w:style w:type="table" w:default="1" w:styleId="TableNormal">

</xml_diff>